<commit_message>
feat: transcrever audio via Whisper quando memo URL nao tem texto
Detecta content-type de audio direto na URL, ou <audio> embutido na
pagina quando o HTML extraido tem pouco/nenhum texto, e transcreve
via OpenAI Whisper antes do pipeline normal de resumo/keywords/categoria.
Atualiza o manual operacional com o novo comportamento.
</commit_message>
<xml_diff>
--- a/MyMemory_Manual_Operacional.docx
+++ b/MyMemory_Manual_Operacional.docx
@@ -1,29 +1,5 @@
 
-<file path=docProps\app.xml><?xml version="1.0" encoding="utf-8"?>
-<Properties xmlns="http://schemas.openxmlformats.org/officeDocument/2006/extended-properties" xmlns:vt="http://schemas.openxmlformats.org/officeDocument/2006/docPropsVTypes"/>
-</file>
-
-<file path=docProps\core.xml><?xml version="1.0" encoding="utf-8"?>
-<cp:coreProperties xmlns:cp="http://schemas.openxmlformats.org/package/2006/metadata/core-properties" xmlns:dc="http://purl.org/dc/elements/1.1/" xmlns:dcterms="http://purl.org/dc/terms/" xmlns:dcmitype="http://purl.org/dc/dcmitype/" xmlns:xsi="http://www.w3.org/2001/XMLSchema-instance">
-  <dc:title>MyMemory — Manual Operacional de Suporte</dc:title>
-  <dc:creator>MyMemory System</dc:creator>
-  <dc:description>Manual operacional indexado por telas para suporte ao usuário.</dc:description>
-  <cp:lastModifiedBy>Un-named</cp:lastModifiedBy>
-  <cp:revision>1</cp:revision>
-  <dcterms:created xsi:type="dcterms:W3CDTF">2026-06-25T02:31:58.346Z</dcterms:created>
-  <dcterms:modified xsi:type="dcterms:W3CDTF">2026-06-25T02:31:58.348Z</dcterms:modified>
-</cp:coreProperties>
-</file>
-
-<file path=docProps\custom.xml><?xml version="1.0" encoding="utf-8"?>
-<Properties xmlns="http://schemas.openxmlformats.org/officeDocument/2006/custom-properties" xmlns:vt="http://schemas.openxmlformats.org/officeDocument/2006/docPropsVTypes"/>
-</file>
-
-<file path=word\comments.xml><?xml version="1.0" encoding="utf-8"?>
-<w:comments xmlns:cx="http://schemas.microsoft.com/office/drawing/2014/chartex" xmlns:cx1="http://schemas.microsoft.com/office/drawing/2015/9/8/chartex" xmlns:cx2="http://schemas.microsoft.com/office/drawing/2015/10/21/chartex" xmlns:cx3="http://schemas.microsoft.com/office/drawing/2016/5/9/chartex" xmlns:cx4="http://schemas.microsoft.com/office/drawing/2016/5/10/chartex" xmlns:cx5="http://schemas.microsoft.com/office/drawing/2016/5/11/chartex" xmlns:cx6="http://schemas.microsoft.com/office/drawing/2016/5/12/chartex" xmlns:cx7="http://schemas.microsoft.com/office/drawing/2016/5/13/chartex" xmlns:cx8="http://schemas.microsoft.com/office/drawing/2016/5/14/chartex" xmlns:mc="http://schemas.openxmlformats.org/markup-compatibility/2006" xmlns:aink="http://schemas.microsoft.com/office/drawing/2016/ink" xmlns:am3d="http://schemas.microsoft.com/office/drawing/2017/model3d" xmlns:o="urn:schemas-microsoft-com:office:office" xmlns:r="http://schemas.openxmlformats.org/officeDocument/2006/relationships" xmlns:m="http://schemas.openxmlformats.org/officeDocument/2006/math" xmlns:v="urn:schemas-microsoft-com:vml" xmlns:wp14="http://schemas.microsoft.com/office/word/2010/wordprocessingDrawing" xmlns:wp="http://schemas.openxmlformats.org/drawingml/2006/wordprocessingDrawing" xmlns:w10="urn:schemas-microsoft-com:office:word" xmlns:w="http://schemas.openxmlformats.org/wordprocessingml/2006/main" xmlns:w14="http://schemas.microsoft.com/office/word/2010/wordml" xmlns:w15="http://schemas.microsoft.com/office/word/2012/wordml" xmlns:w16cex="http://schemas.microsoft.com/office/word/2018/wordml/cex" xmlns:w16cid="http://schemas.microsoft.com/office/word/2016/wordml/cid" xmlns:w16="http://schemas.microsoft.com/office/word/2018/wordml" xmlns:w16sdtdh="http://schemas.microsoft.com/office/word/2020/wordml/sdtdatahash" xmlns:w16se="http://schemas.microsoft.com/office/word/2015/wordml/symex" xmlns:wpg="http://schemas.microsoft.com/office/word/2010/wordprocessingGroup" xmlns:wpi="http://schemas.microsoft.com/office/word/2010/wordprocessingInk" xmlns:wne="http://schemas.microsoft.com/office/word/2006/wordml" xmlns:wps="http://schemas.microsoft.com/office/word/2010/wordprocessingShape"/>
-</file>
-
-<file path=word\document.xml><?xml version="1.0" encoding="utf-8"?>
+<file path=word/document.xml><?xml version="1.0" encoding="utf-8"?>
 <w:document xmlns:wpc="http://schemas.microsoft.com/office/word/2010/wordprocessingCanvas" xmlns:mc="http://schemas.openxmlformats.org/markup-compatibility/2006" xmlns:o="urn:schemas-microsoft-com:office:office" xmlns:r="http://schemas.openxmlformats.org/officeDocument/2006/relationships" xmlns:m="http://schemas.openxmlformats.org/officeDocument/2006/math" xmlns:v="urn:schemas-microsoft-com:vml" xmlns:wp14="http://schemas.microsoft.com/office/word/2010/wordprocessingDrawing" xmlns:wp="http://schemas.openxmlformats.org/drawingml/2006/wordprocessingDrawing" xmlns:w10="urn:schemas-microsoft-com:office:word" xmlns:w="http://schemas.openxmlformats.org/wordprocessingml/2006/main" xmlns:w14="http://schemas.microsoft.com/office/word/2010/wordml" xmlns:w15="http://schemas.microsoft.com/office/word/2012/wordml" xmlns:wpg="http://schemas.microsoft.com/office/word/2010/wordprocessingGroup" xmlns:wpi="http://schemas.microsoft.com/office/word/2010/wordprocessingInk" xmlns:wne="http://schemas.microsoft.com/office/word/2006/wordml" xmlns:wps="http://schemas.microsoft.com/office/word/2010/wordprocessingShape" xmlns:cx="http://schemas.microsoft.com/office/drawing/2014/chartex" xmlns:cx1="http://schemas.microsoft.com/office/drawing/2015/9/8/chartex" xmlns:cx2="http://schemas.microsoft.com/office/drawing/2015/10/21/chartex" xmlns:cx3="http://schemas.microsoft.com/office/drawing/2016/5/9/chartex" xmlns:cx4="http://schemas.microsoft.com/office/drawing/2016/5/10/chartex" xmlns:cx5="http://schemas.microsoft.com/office/drawing/2016/5/11/chartex" xmlns:cx6="http://schemas.microsoft.com/office/drawing/2016/5/12/chartex" xmlns:cx7="http://schemas.microsoft.com/office/drawing/2016/5/13/chartex" xmlns:cx8="http://schemas.microsoft.com/office/drawing/2016/5/14/chartex" xmlns:aink="http://schemas.microsoft.com/office/drawing/2016/ink" xmlns:am3d="http://schemas.microsoft.com/office/drawing/2017/model3d" xmlns:w16cex="http://schemas.microsoft.com/office/word/2018/wordml/cex" xmlns:w16cid="http://schemas.microsoft.com/office/word/2016/wordml/cid" xmlns:w16="http://schemas.microsoft.com/office/word/2018/wordml" xmlns:w16sdtdh="http://schemas.microsoft.com/office/word/2020/wordml/sdtdatahash" xmlns:w16se="http://schemas.microsoft.com/office/word/2015/wordml/symex" mc:Ignorable="w14 w15 wp14">
   <w:body>
     <w:p>
@@ -3594,6 +3570,23 @@
         </w:rPr>
       </w:pPr>
       <w:r>
+        <w:t xml:space="preserve">Se a URL apontar diretamente para um arquivo de áudio, ou a página tiver pouco ou nenhum texto mas houver um player de áudio embutido, o sistema transcreve a narração automaticamente via IA (OpenAI Whisper), respeitando um limite de 20 MB por áudio.</w:t>
+      </w:r>
+    </w:p>
+    <w:p>
+      <w:pPr>
+        <w:pStyle w:val="ListParagraph"/>
+        <w:numPr>
+          <w:ilvl w:val="0"/>
+          <w:numId w:val="1"/>
+        </w:numPr>
+        <w:spacing w:after="40" w:before="40"/>
+        <w:rPr>
+          <w:sz w:val="22"/>
+          <w:szCs w:val="22"/>
+        </w:rPr>
+      </w:pPr>
+      <w:r>
         <w:t xml:space="preserve">O texto segue o pipeline normal.</w:t>
       </w:r>
     </w:p>
@@ -3829,6 +3822,38 @@
           </w:p>
         </w:tc>
       </w:tr>
+      <w:tr>
+        <w:tc>
+          <w:tcPr>
+            <w:tcW w:type="pct" w:w="30%"/>
+          </w:tcPr>
+          <w:p>
+            <w:r>
+              <w:rPr>
+                <w:b/>
+                <w:bCs/>
+                <w:sz w:val="20"/>
+                <w:szCs w:val="20"/>
+              </w:rPr>
+              <w:t xml:space="preserve">Áudio da URL muito grande (acima de 20 MB)</w:t>
+            </w:r>
+          </w:p>
+        </w:tc>
+        <w:tc>
+          <w:tcPr>
+            <w:tcW w:type="pct" w:w="70%"/>
+          </w:tcPr>
+          <w:p>
+            <w:r>
+              <w:rPr>
+                <w:sz w:val="20"/>
+                <w:szCs w:val="20"/>
+              </w:rPr>
+              <w:t xml:space="preserve">Limite de transcrição automática via Whisper; catalogar o áudio separadamente pelo tipo Áudio.</w:t>
+            </w:r>
+          </w:p>
+        </w:tc>
+      </w:tr>
     </w:tbl>
     <w:p>
       <w:r>
@@ -18088,7 +18113,11 @@
 </w:document>
 </file>
 
-<file path=word\endnotes.xml><?xml version="1.0" encoding="utf-8"?>
+<file path=word/comments.xml><?xml version="1.0" encoding="utf-8"?>
+<w:comments xmlns:cx="http://schemas.microsoft.com/office/drawing/2014/chartex" xmlns:cx1="http://schemas.microsoft.com/office/drawing/2015/9/8/chartex" xmlns:cx2="http://schemas.microsoft.com/office/drawing/2015/10/21/chartex" xmlns:cx3="http://schemas.microsoft.com/office/drawing/2016/5/9/chartex" xmlns:cx4="http://schemas.microsoft.com/office/drawing/2016/5/10/chartex" xmlns:cx5="http://schemas.microsoft.com/office/drawing/2016/5/11/chartex" xmlns:cx6="http://schemas.microsoft.com/office/drawing/2016/5/12/chartex" xmlns:cx7="http://schemas.microsoft.com/office/drawing/2016/5/13/chartex" xmlns:cx8="http://schemas.microsoft.com/office/drawing/2016/5/14/chartex" xmlns:mc="http://schemas.openxmlformats.org/markup-compatibility/2006" xmlns:aink="http://schemas.microsoft.com/office/drawing/2016/ink" xmlns:am3d="http://schemas.microsoft.com/office/drawing/2017/model3d" xmlns:o="urn:schemas-microsoft-com:office:office" xmlns:r="http://schemas.openxmlformats.org/officeDocument/2006/relationships" xmlns:m="http://schemas.openxmlformats.org/officeDocument/2006/math" xmlns:v="urn:schemas-microsoft-com:vml" xmlns:wp14="http://schemas.microsoft.com/office/word/2010/wordprocessingDrawing" xmlns:wp="http://schemas.openxmlformats.org/drawingml/2006/wordprocessingDrawing" xmlns:w10="urn:schemas-microsoft-com:office:word" xmlns:w="http://schemas.openxmlformats.org/wordprocessingml/2006/main" xmlns:w14="http://schemas.microsoft.com/office/word/2010/wordml" xmlns:w15="http://schemas.microsoft.com/office/word/2012/wordml" xmlns:w16cex="http://schemas.microsoft.com/office/word/2018/wordml/cex" xmlns:w16cid="http://schemas.microsoft.com/office/word/2016/wordml/cid" xmlns:w16="http://schemas.microsoft.com/office/word/2018/wordml" xmlns:w16sdtdh="http://schemas.microsoft.com/office/word/2020/wordml/sdtdatahash" xmlns:w16se="http://schemas.microsoft.com/office/word/2015/wordml/symex" xmlns:wpg="http://schemas.microsoft.com/office/word/2010/wordprocessingGroup" xmlns:wpi="http://schemas.microsoft.com/office/word/2010/wordprocessingInk" xmlns:wne="http://schemas.microsoft.com/office/word/2006/wordml" xmlns:wps="http://schemas.microsoft.com/office/word/2010/wordprocessingShape"/>
+</file>
+
+<file path=word/endnotes.xml><?xml version="1.0" encoding="utf-8"?>
 <w:endnotes xmlns:wpc="http://schemas.microsoft.com/office/word/2010/wordprocessingCanvas" xmlns:mc="http://schemas.openxmlformats.org/markup-compatibility/2006" xmlns:o="urn:schemas-microsoft-com:office:office" xmlns:r="http://schemas.openxmlformats.org/officeDocument/2006/relationships" xmlns:m="http://schemas.openxmlformats.org/officeDocument/2006/math" xmlns:v="urn:schemas-microsoft-com:vml" xmlns:wp14="http://schemas.microsoft.com/office/word/2010/wordprocessingDrawing" xmlns:wp="http://schemas.openxmlformats.org/drawingml/2006/wordprocessingDrawing" xmlns:w10="urn:schemas-microsoft-com:office:word" xmlns:w="http://schemas.openxmlformats.org/wordprocessingml/2006/main" xmlns:w14="http://schemas.microsoft.com/office/word/2010/wordml" xmlns:w15="http://schemas.microsoft.com/office/word/2012/wordml" xmlns:wpg="http://schemas.microsoft.com/office/word/2010/wordprocessingGroup" xmlns:wpi="http://schemas.microsoft.com/office/word/2010/wordprocessingInk" xmlns:wne="http://schemas.microsoft.com/office/word/2006/wordml" xmlns:wps="http://schemas.microsoft.com/office/word/2010/wordprocessingShape" mc:Ignorable="w14 w15 wp14">
   <w:endnote w:type="separator" w:id="-1">
     <w:p>
@@ -18125,11 +18154,7 @@
 </w:endnotes>
 </file>
 
-<file path=word\fontTable.xml><?xml version="1.0" encoding="utf-8"?>
-<w:fonts xmlns:mc="http://schemas.openxmlformats.org/markup-compatibility/2006" xmlns:r="http://schemas.openxmlformats.org/officeDocument/2006/relationships" xmlns:w="http://schemas.openxmlformats.org/wordprocessingml/2006/main" xmlns:w14="http://schemas.microsoft.com/office/word/2010/wordml" xmlns:w15="http://schemas.microsoft.com/office/word/2012/wordml" xmlns:w16cex="http://schemas.microsoft.com/office/word/2018/wordml/cex" xmlns:w16cid="http://schemas.microsoft.com/office/word/2016/wordml/cid" xmlns:w16="http://schemas.microsoft.com/office/word/2018/wordml" xmlns:w16sdtdh="http://schemas.microsoft.com/office/word/2020/wordml/sdtdatahash" xmlns:w16se="http://schemas.microsoft.com/office/word/2015/wordml/symex" mc:Ignorable="w14 w15 w16se w16cid w16 w16cex w16sdtdh"/>
-</file>
-
-<file path=word\footnotes.xml><?xml version="1.0" encoding="utf-8"?>
+<file path=word/footnotes.xml><?xml version="1.0" encoding="utf-8"?>
 <w:footnotes xmlns:wpc="http://schemas.microsoft.com/office/word/2010/wordprocessingCanvas" xmlns:mc="http://schemas.openxmlformats.org/markup-compatibility/2006" xmlns:o="urn:schemas-microsoft-com:office:office" xmlns:r="http://schemas.openxmlformats.org/officeDocument/2006/relationships" xmlns:m="http://schemas.openxmlformats.org/officeDocument/2006/math" xmlns:v="urn:schemas-microsoft-com:vml" xmlns:wp14="http://schemas.microsoft.com/office/word/2010/wordprocessingDrawing" xmlns:wp="http://schemas.openxmlformats.org/drawingml/2006/wordprocessingDrawing" xmlns:w10="urn:schemas-microsoft-com:office:word" xmlns:w="http://schemas.openxmlformats.org/wordprocessingml/2006/main" xmlns:w14="http://schemas.microsoft.com/office/word/2010/wordml" xmlns:w15="http://schemas.microsoft.com/office/word/2012/wordml" xmlns:wpg="http://schemas.microsoft.com/office/word/2010/wordprocessingGroup" xmlns:wpi="http://schemas.microsoft.com/office/word/2010/wordprocessingInk" xmlns:wne="http://schemas.microsoft.com/office/word/2006/wordml" xmlns:wps="http://schemas.microsoft.com/office/word/2010/wordprocessingShape" mc:Ignorable="w14 w15 wp14">
   <w:footnote w:type="separator" w:id="-1">
     <w:p>
@@ -18166,7 +18191,7 @@
 </w:footnotes>
 </file>
 
-<file path=word\numbering.xml><?xml version="1.0" encoding="utf-8"?>
+<file path=word/numbering.xml><?xml version="1.0" encoding="utf-8"?>
 <w:numbering xmlns:wpc="http://schemas.microsoft.com/office/word/2010/wordprocessingCanvas" xmlns:mc="http://schemas.openxmlformats.org/markup-compatibility/2006" xmlns:o="urn:schemas-microsoft-com:office:office" xmlns:r="http://schemas.openxmlformats.org/officeDocument/2006/relationships" xmlns:m="http://schemas.openxmlformats.org/officeDocument/2006/math" xmlns:v="urn:schemas-microsoft-com:vml" xmlns:wp14="http://schemas.microsoft.com/office/word/2010/wordprocessingDrawing" xmlns:wp="http://schemas.openxmlformats.org/drawingml/2006/wordprocessingDrawing" xmlns:w10="urn:schemas-microsoft-com:office:word" xmlns:w="http://schemas.openxmlformats.org/wordprocessingml/2006/main" xmlns:w14="http://schemas.microsoft.com/office/word/2010/wordml" xmlns:w15="http://schemas.microsoft.com/office/word/2012/wordml" xmlns:wpg="http://schemas.microsoft.com/office/word/2010/wordprocessingGroup" xmlns:wpi="http://schemas.microsoft.com/office/word/2010/wordprocessingInk" xmlns:wne="http://schemas.microsoft.com/office/word/2006/wordml" xmlns:wps="http://schemas.microsoft.com/office/word/2010/wordprocessingShape" mc:Ignorable="w14 w15 wp14">
   <w:abstractNum w:abstractNumId="1" w15:restartNumberingAfterBreak="0">
     <w:multiLevelType w:val="hybridMultilevel"/>
@@ -18261,17 +18286,7 @@
 </w:numbering>
 </file>
 
-<file path=word\settings.xml><?xml version="1.0" encoding="utf-8"?>
-<w:settings xmlns:wpc="http://schemas.microsoft.com/office/word/2010/wordprocessingCanvas" xmlns:mc="http://schemas.openxmlformats.org/markup-compatibility/2006" xmlns:o="urn:schemas-microsoft-com:office:office" xmlns:r="http://schemas.openxmlformats.org/officeDocument/2006/relationships" xmlns:m="http://schemas.openxmlformats.org/officeDocument/2006/math" xmlns:v="urn:schemas-microsoft-com:vml" xmlns:wp14="http://schemas.microsoft.com/office/word/2010/wordprocessingDrawing" xmlns:wp="http://schemas.openxmlformats.org/drawingml/2006/wordprocessingDrawing" xmlns:w10="urn:schemas-microsoft-com:office:word" xmlns:w="http://schemas.openxmlformats.org/wordprocessingml/2006/main" xmlns:w14="http://schemas.microsoft.com/office/word/2010/wordml" xmlns:w15="http://schemas.microsoft.com/office/word/2012/wordml" xmlns:wpg="http://schemas.microsoft.com/office/word/2010/wordprocessingGroup" xmlns:wpi="http://schemas.microsoft.com/office/word/2010/wordprocessingInk" xmlns:wne="http://schemas.microsoft.com/office/word/2006/wordml" xmlns:wps="http://schemas.microsoft.com/office/word/2010/wordprocessingShape" mc:Ignorable="w14 w15 wp14">
-  <w:displayBackgroundShape/>
-  <w:evenAndOddHeaders w:val="false"/>
-  <w:compat>
-    <w:compatSetting w:val="15" w:name="compatibilityMode" w:uri="http://schemas.microsoft.com/office/word"/>
-  </w:compat>
-</w:settings>
-</file>
-
-<file path=word\styles.xml><?xml version="1.0" encoding="utf-8"?>
+<file path=word/styles.xml><?xml version="1.0" encoding="utf-8"?>
 <w:styles xmlns:mc="http://schemas.openxmlformats.org/markup-compatibility/2006" xmlns:r="http://schemas.openxmlformats.org/officeDocument/2006/relationships" xmlns:w="http://schemas.openxmlformats.org/wordprocessingml/2006/main" xmlns:w14="http://schemas.microsoft.com/office/word/2010/wordml" xmlns:w15="http://schemas.microsoft.com/office/word/2012/wordml" mc:Ignorable="w14 w15">
   <w:docDefaults>
     <w:rPrDefault>

</xml_diff>